<commit_message>
feat: add Word ATS resume bonus mission to week 2 slides and manuals
</commit_message>
<xml_diff>
--- a/downloads/Week02_商業檔案結構化與Markdown練習.docx
+++ b/downloads/Week02_商業檔案結構化與Markdown練習.docx
@@ -810,7 +810,7 @@
               <w:br/>
               <w:t>【修復需求】：</w:t>
               <w:br/>
-              <w:t>1. 表格第二欄「門市數」由原本靠左改為「置中對齊 (|:---:|)」。</w:t>
+              <w:t>1. 營運表格中，請將第二欄「門市數」由原本靠左改為「置中對齊 (|:---:|)」。</w:t>
               <w:br/>
               <w:t>2. 在財務部 Linda 的決議後面，強調「供應商若延遲上線，每日處以合約總額千分之二罰款之 SLA 條款」。</w:t>
               <w:br/>
@@ -849,7 +849,144 @@
         <w:pStyle w:val="Heading1"/>
       </w:pPr>
       <w:r>
-        <w:t>六、 學期後續大案藍圖：今晚基礎如何直通高階商業應用？</w:t>
+        <w:t>六、 實作彩蛋關卡：調度 AI 起草個人專屬【高階商務 ATS 履歷】並一鍵貼入 Word (15 分鐘)</w:t>
+      </w:r>
+    </w:p>
+    <w:p>
+      <w:r>
+        <w:rPr>
+          <w:b/>
+        </w:rPr>
+        <w:t>【任務目標】：</w:t>
+      </w:r>
+      <w:r>
+        <w:t>這是進修部企管系同學最實戰的超值資產！調度 AI 扮演頂級外商獵頭顧問，根據個人背景起草一份具備國際競爭力的「ATS 最佳化高階商務履歷」，並體驗一鍵貼入 Word 自動轉換為專業版面！</w:t>
+        <w:br/>
+      </w:r>
+      <w:r>
+        <w:rPr>
+          <w:b/>
+        </w:rPr>
+        <w:t>【一步一步帶你做 SOP】：</w:t>
+        <w:br/>
+      </w:r>
+      <w:r>
+        <w:t>• 步驟 1：複製下方【ATS 履歷起草 Prompt】，將括號中的 [姓名] 與現職經歷替換為個人背景（或直接使用預設模擬內容）。</w:t>
+        <w:br/>
+        <w:t>• 步驟 2：貼入 Antigravity 桌面版（或 Google AI Studio 網頁版）送出，5 秒鐘見證 AI 產出具備 STAR 原則與量化成果的高階履歷！</w:t>
+        <w:br/>
+        <w:t>• 步驟 3：全選複製 AI 產出的 Markdown 內容，打開電腦上的 Microsoft Word 貼上，親眼見證標題樣式、職能清單與專案成就瞬間排版完成！</w:t>
+        <w:br/>
+        <w:t>• 步驟 4：對 Antigravity 說：『請幫我存為 03_Deliverables/個人高階商務履歷_v1.0.md 並自動 push 到 GitHub！』下課手機打開隨時展示！</w:t>
+      </w:r>
+    </w:p>
+    <w:tbl>
+      <w:tblPr>
+        <w:tblW w:type="auto" w:w="0"/>
+        <w:jc w:val="center"/>
+        <w:tblLayout w:type="fixed"/>
+        <w:tblLook w:firstColumn="1" w:firstRow="1" w:lastColumn="0" w:lastRow="0" w:noHBand="0" w:noVBand="1" w:val="04A0"/>
+      </w:tblPr>
+      <w:tblGrid>
+        <w:gridCol w:w="9360"/>
+      </w:tblGrid>
+      <w:tr>
+        <w:tc>
+          <w:tcPr>
+            <w:tcW w:type="dxa" w:w="9360"/>
+            <w:shd w:fill="F8FAFC"/>
+            <w:tcMar>
+              <w:top w:w="160" w:type="dxa"/>
+              <w:bottom w:w="160" w:type="dxa"/>
+              <w:left w:w="200" w:type="dxa"/>
+              <w:right w:w="200" w:type="dxa"/>
+            </w:tcMar>
+            <w:tcBorders>
+              <w:top w:val="single" w:sz="6" w:space="0" w:color="CBD5E1"/>
+              <w:left w:val="single" w:sz="24" w:space="0" w:color="0284C7"/>
+              <w:bottom w:val="single" w:sz="6" w:space="0" w:color="CBD5E1"/>
+              <w:right w:val="single" w:sz="6" w:space="0" w:color="CBD5E1"/>
+            </w:tcBorders>
+          </w:tcPr>
+          <w:p>
+            <w:pPr>
+              <w:spacing w:before="0" w:after="80"/>
+            </w:pPr>
+            <w:r>
+              <w:rPr>
+                <w:b/>
+                <w:color w:val="0284C7"/>
+                <w:sz w:val="22"/>
+              </w:rPr>
+              <w:t>📋 【可直接複製之 Prompt 指令】 ｜ 🎭 設定角色：全球頂級獵頭顧問 兼 外商人資長 (CHRO)</w:t>
+              <w:br/>
+            </w:r>
+            <w:r>
+              <w:rPr>
+                <w:rFonts w:ascii="Consolas" w:hAnsi="Consolas"/>
+                <w:color w:val="0F172A"/>
+                <w:sz w:val="20"/>
+              </w:rPr>
+              <w:t>【角色設定】：你是一位擁有 15 年跨國高階獵頭經驗的資深顧問兼人資長。</w:t>
+              <w:br/>
+              <w:t>【背景情境】：我是萬能科技大學企業管理系（進修部）的學生，白天在職場工作，希望運用 AI 起草一份具備國際競爭力的「高階商務 ATS 最佳化專業履歷」。</w:t>
+              <w:br/>
+              <w:t>【個人背景資訊】：</w:t>
+              <w:br/>
+              <w:t>- 姓名：[請填寫個人姓名，如：王小明]</w:t>
+              <w:br/>
+              <w:t>- 學歷：萬能科技大學 企業管理系（進修學士班在學中，主修商業軟體應用、智慧決策、大數據分析）</w:t>
+              <w:br/>
+              <w:t>- 現職/經歷：[請填寫現職，如：連鎖零售門市副店長 / 行政採購專員 / 倉儲物流專員]</w:t>
+              <w:br/>
+              <w:t>- 核心職能：流程自動化、跨部門溝通、門市營運管理、成本控制、Office 辦公應用、AI 代理人協同</w:t>
+              <w:br/>
+              <w:t>【約束限制】：</w:t>
+              <w:br/>
+              <w:t>1. 嚴格使用 Markdown 語法排版，方便我一鍵複製貼入 Word 自動套用階層樣式。</w:t>
+              <w:br/>
+              <w:t>2. 經歷描述嚴格遵循【STAR 原則】（情境、任務、行動、結果），行動動詞需強烈有力（如：主導、優化、提升、節省）。</w:t>
+              <w:br/>
+              <w:t>3. 輸出包含：</w:t>
+              <w:br/>
+              <w:t xml:space="preserve">   (a) 核心專業個人簡介 (Executive Summary，150 字)</w:t>
+              <w:br/>
+              <w:t xml:space="preserve">   (b) 六大核心職能關鍵字標籤卡</w:t>
+              <w:br/>
+              <w:t xml:space="preserve">   (c) 工作經歷與量化成就（包含具體百分比與營收數據）</w:t>
+              <w:br/>
+              <w:t xml:space="preserve">   (d) 教育背景與專業證照（經濟部 iPAS「AI 應用規劃師」等）</w:t>
+              <w:br/>
+              <w:t>【核心任務】：請為我起草產出這份專業、具備高說服力的高階商務履歷！</w:t>
+            </w:r>
+          </w:p>
+          <w:p>
+            <w:pPr>
+              <w:spacing w:before="120" w:after="0"/>
+            </w:pPr>
+            <w:r>
+              <w:rPr>
+                <w:i/>
+                <w:color w:val="B45309"/>
+                <w:sz w:val="19"/>
+              </w:rPr>
+              <w:t>💡 經理人操作要領：複製貼入 Word 即可一秒擁有排版工整的外商級履歷，還能存於 GitHub 作為個人數位資產！</w:t>
+            </w:r>
+          </w:p>
+        </w:tc>
+      </w:tr>
+    </w:tbl>
+    <w:p>
+      <w:pPr>
+        <w:spacing w:after="120"/>
+      </w:pPr>
+    </w:p>
+    <w:p>
+      <w:pPr>
+        <w:pStyle w:val="Heading1"/>
+      </w:pPr>
+      <w:r>
+        <w:t>七、 學期後續大案藍圖：今晚基礎如何直通高階商業應用？</w:t>
       </w:r>
     </w:p>
     <w:p>
@@ -1186,7 +1323,7 @@
         <w:pStyle w:val="Heading1"/>
       </w:pPr>
       <w:r>
-        <w:t>七、 課堂常見突發狀況排解指南 (FAQ)</w:t>
+        <w:t>八、 課堂常見突發狀況排解指南 (FAQ)</w:t>
       </w:r>
     </w:p>
     <w:p>

</xml_diff>

<commit_message>
feat: provide 8 messy filenames disaster zip and integrate AI audit workflow into week 2
</commit_message>
<xml_diff>
--- a/downloads/Week02_商業檔案結構化與Markdown練習.docx
+++ b/downloads/Week02_商業檔案結構化與Markdown練習.docx
@@ -286,7 +286,7 @@
         <w:pStyle w:val="Heading1"/>
       </w:pPr>
       <w:r>
-        <w:t>二、 實作關卡一：調度 AI 自動建立企業四層樹與 README 首頁 (15 分鐘)</w:t>
+        <w:t>二、 實作關卡一：調度 AI 診斷「混亂命名災難」、自動重構為 ISO 8601 與四層樹 (15 分鐘)</w:t>
       </w:r>
     </w:p>
     <w:p>
@@ -297,7 +297,7 @@
         <w:t>【任務目標】：</w:t>
       </w:r>
       <w:r>
-        <w:t>徹底告別手工建立資料夾！指揮 AI 規劃標準四層治理樹 (00_Admin ~ 03_Deliverables) 與 README.md 導覽手冊。</w:t>
+        <w:t>面對前任同仁留下的『最新版_真的最終版.docx』等失控命名，學生扮演企業數位資產審計長，指令 AI 自動產出前後對照審計表，並自動建立四層目錄樹 (00_Admin ~ 03_Deliverables) 與 README.md 首頁。</w:t>
         <w:br/>
       </w:r>
       <w:r>
@@ -308,14 +308,83 @@
         <w:br/>
       </w:r>
       <w:r>
-        <w:t>• 步驟 1：開啟 Antigravity 桌面版（或 Google AI Studio 網頁版）。</w:t>
+        <w:t>• 步驟 1：檢視下方【待治理的 8 個混亂檔案清單】（或於教學網站下載實例包解壓縮）。</w:t>
         <w:br/>
-        <w:t>• 步驟 2：複製下方【任務一 Prompt】，貼入對話框按下 Enter 送出。</w:t>
+        <w:t>• 步驟 2：複製下方【任務一 Prompt】，貼入 Antigravity 桌面版（或 Google AI Studio 網頁版）。</w:t>
         <w:br/>
-        <w:t>• 步驟 3：觀測 AI 秒速產出包含專案簡介、四層資料夾與 ISO 8601 規範之 README.md 全文。</w:t>
+        <w:t>• 步驟 3：觀測 AI 3 秒內自主產出：</w:t>
         <w:br/>
-        <w:t>• 步驟 4：若使用 Antigravity 桌面版，可直接加一句：『請將上述內容自動存為本專案的 README.md 檔案』，AI 自動在背景建好！</w:t>
+        <w:t xml:space="preserve">   ① 命名風險診斷與【治理前後對照審計表 (Before vs. After)】</w:t>
+        <w:br/>
+        <w:t xml:space="preserve">   ② 四層目錄標準歸檔規劃</w:t>
+        <w:br/>
+        <w:t xml:space="preserve">   ③ 完整的專案首頁 README.md 原始內容！</w:t>
+        <w:br/>
+        <w:t>• 步驟 4：使用 Antigravity 桌面版同學，可直接加一句：『請在本地專案建立這四個資料夾並存檔 README.md』，AI 自動在背景建好！</w:t>
       </w:r>
+    </w:p>
+    <w:tbl>
+      <w:tblPr>
+        <w:tblW w:type="auto" w:w="0"/>
+        <w:tblLook w:firstColumn="1" w:firstRow="1" w:lastColumn="0" w:lastRow="0" w:noHBand="0" w:noVBand="1" w:val="04A0"/>
+      </w:tblPr>
+      <w:tblGrid>
+        <w:gridCol w:w="9360"/>
+      </w:tblGrid>
+      <w:tr>
+        <w:tc>
+          <w:tcPr>
+            <w:tcW w:type="dxa" w:w="9360"/>
+            <w:shd w:fill="FEE2E2"/>
+            <w:tcMar>
+              <w:top w:w="140" w:type="dxa"/>
+              <w:bottom w:w="140" w:type="dxa"/>
+              <w:left w:w="180" w:type="dxa"/>
+              <w:right w:w="180" w:type="dxa"/>
+            </w:tcMar>
+          </w:tcPr>
+          <w:p>
+            <w:pPr>
+              <w:spacing w:after="0"/>
+            </w:pPr>
+            <w:r>
+              <w:rPr>
+                <w:b/>
+                <w:color w:val="991B1B"/>
+              </w:rPr>
+              <w:t>⚠️ 【前任同仁留下的 8 個混亂命名真實檔案（版本混亂現場）】：</w:t>
+              <w:br/>
+            </w:r>
+            <w:r>
+              <w:rPr>
+                <w:sz w:val="19"/>
+              </w:rPr>
+              <w:t>1. 會議記錄_最新版_final.docx</w:t>
+              <w:br/>
+              <w:t>2. 會議記錄_真的最終版_主任改過.docx</w:t>
+              <w:br/>
+              <w:t>3. 2026年9月門市預算表_小美修改版_最終不改版.xlsx</w:t>
+              <w:br/>
+              <w:t>4. 董事會報告_David總經理最終確定版(1).pptx</w:t>
+              <w:br/>
+              <w:t>5. 智慧零售企劃草案_v2_new_final_FINAL.docx</w:t>
+              <w:br/>
+              <w:t>6. 門市POS合約條款_Linda審核版_最新.docx</w:t>
+              <w:br/>
+              <w:t>7. 北中南18家門市名冊_小林手打備份.xlsx</w:t>
+              <w:br/>
+              <w:t>8. 重要通知_千萬不要刪除.txt</w:t>
+              <w:br/>
+              <w:t>（痛點：無日期無法排序、主觀詞彙無法確認誰最新、版本覆蓋引發履約客訴風險！）</w:t>
+            </w:r>
+          </w:p>
+        </w:tc>
+      </w:tr>
+    </w:tbl>
+    <w:p>
+      <w:pPr>
+        <w:spacing w:after="160"/>
+      </w:pPr>
     </w:p>
     <w:tbl>
       <w:tblPr>
@@ -355,7 +424,7 @@
                 <w:color w:val="0284C7"/>
                 <w:sz w:val="22"/>
               </w:rPr>
-              <w:t>📋 【可直接複製之 Prompt 指令】 ｜ 🎭 設定角色：企業資深數位資產架構師</w:t>
+              <w:t>📋 【可直接複製之 Prompt 指令】 ｜ 🎭 設定角色：企業數位資產審計長 兼 DevOps 架構師</w:t>
               <w:br/>
             </w:r>
             <w:r>
@@ -364,27 +433,45 @@
                 <w:color w:val="0F172A"/>
                 <w:sz w:val="20"/>
               </w:rPr>
-              <w:t>【角色設定】：你是一位頂級企業數位資產架構師與知識管理總監。</w:t>
+              <w:t>【角色設定】：你是一位頂級企業數位資產審計長與知識管理總監。</w:t>
               <w:br/>
-              <w:t>【背景情境】：我們是萬能科大企業管理系「商業軟體應用」專案團隊，正在建立標準化企業數位倉儲（專案名稱：vnu-business-docs）。</w:t>
+              <w:t>【背景情境】：我們是萬能科大企業管理系團隊，剛接手前任同仁留下的一批極度混亂的專案檔案（全部堆在同一層目錄，命名充滿「最新版_真的最終版」等版本失控問題）。</w:t>
               <w:br/>
-              <w:t>【約束限制】：</w:t>
+              <w:t>【待治理的 8 個混亂檔案清單】：</w:t>
               <w:br/>
-              <w:t>1. 建立標準四層樹狀資料夾治理架構，目錄代碼為：</w:t>
+              <w:t>1. 會議記錄_最新版_final.docx</w:t>
               <w:br/>
-              <w:t xml:space="preserve">   - 00_Admin（專案章程、權限名冊、行政規章）</w:t>
+              <w:t>2. 會議記錄_真的最終版_主任改過.docx</w:t>
               <w:br/>
-              <w:t xml:space="preserve">   - 01_Raw_Data（未經加工的外部原始資料、市場調研報表）</w:t>
+              <w:t>3. 2026年9月門市預算表_小美修改版_最終不改版.xlsx</w:t>
               <w:br/>
-              <w:t xml:space="preserve">   - 02_Working_Drafts（進行中的企劃草案、Word 底稿、數據分析過程）</w:t>
+              <w:t>4. 董事會報告_David總經理最終確定版(1).pptx</w:t>
               <w:br/>
-              <w:t xml:space="preserve">   - 03_Deliverables（經總監簽核的最終交付報告、發布檔）</w:t>
+              <w:t>5. 智慧零售企劃草案_v2_new_final_FINAL.docx</w:t>
               <w:br/>
-              <w:t>2. 產出一份專業的 README.md 導航首頁，包含專案簡介、四層目錄結構說明、ISO 8601 命名規範與團隊維護清單。</w:t>
+              <w:t>6. 門市POS合約條款_Linda審核版_最新.docx</w:t>
               <w:br/>
-              <w:t>3. 語法必須完全符合 GitHub Markdown 規範。</w:t>
+              <w:t>7. 北中南18家門市名冊_小林手打備份.xlsx</w:t>
               <w:br/>
-              <w:t>【核心任務】：請為我起草產出完整的 README.md 原始內容，供我直接作為專案首頁！</w:t>
+              <w:t>8. 重要通知_千萬不要刪除.txt</w:t>
+              <w:br/>
+              <w:t>【治理約束與任務】：</w:t>
+              <w:br/>
+              <w:t>1. [診斷與重命名]：依據【ISO 8601 (2026-09-21) ＋ 語意主題 ＋ 語意化版本 (v1.0)】規範，繪製一張「檔案治理前後對照審計表 (Before vs. After)」，包含原檔名、潛在風險、修正後檔名。</w:t>
+              <w:br/>
+              <w:t>2. [四層治理歸檔]：將修正後的檔案自動分派至標準四層架構樹：</w:t>
+              <w:br/>
+              <w:t xml:space="preserve">   - 00_Admin（行政規章、通知備忘）</w:t>
+              <w:br/>
+              <w:t xml:space="preserve">   - 01_Raw_Data（外部原始數據、門市原始名冊）</w:t>
+              <w:br/>
+              <w:t xml:space="preserve">   - 02_Working_Drafts（進行中草案、歷次會議記錄）</w:t>
+              <w:br/>
+              <w:t xml:space="preserve">   - 03_Deliverables（經總監簽核的最終董事會簡報、預算表與合約）</w:t>
+              <w:br/>
+              <w:t>3. [自動產出首頁]：輸出完整的 GitHub 專案首頁 README.md，包含專案簡介、四層目錄結構與版本管理準則。</w:t>
+              <w:br/>
+              <w:t>【交付指令】：請依上述分析產出完整 README.md 原始內容，供我直接建立專案首頁！</w:t>
             </w:r>
           </w:p>
           <w:p>
@@ -397,7 +484,7 @@
                 <w:color w:val="B45309"/>
                 <w:sz w:val="19"/>
               </w:rPr>
-              <w:t>💡 經理人操作要領：零手工敲指令！由 AI 代理人自動規劃企業級架構並建立首頁。</w:t>
+              <w:t>💡 經理人操作要領：AI 代理人自主診斷命名漏洞，秒級重構為 ISO 8601 國際企業規格並自動建立首頁！</w:t>
             </w:r>
           </w:p>
         </w:tc>

</xml_diff>

<commit_message>
feat: ground mission 2 directly in disaster draft file so all students refactor unified data
</commit_message>
<xml_diff>
--- a/downloads/Week02_商業檔案結構化與Markdown練習.docx
+++ b/downloads/Week02_商業檔案結構化與Markdown練習.docx
@@ -500,7 +500,7 @@
         <w:pStyle w:val="Heading1"/>
       </w:pPr>
       <w:r>
-        <w:t>三、 實作關卡二：指令 AI 自動生成標準公文與四欄對齊決策表格 (15 分鐘)</w:t>
+        <w:t>三、 實作關卡二：指令 AI 重構混亂草案為標準公文與四欄對齊決策表格 (15 分鐘)</w:t>
       </w:r>
     </w:p>
     <w:p>
@@ -511,7 +511,7 @@
         <w:t>【任務目標】：</w:t>
       </w:r>
       <w:r>
-        <w:t>告別手工畫表格與計算欄位冒號！指令 AI 自動生成 Markdown 商業公文、主管引用框、金額強制靠右表格與待辦核選清單。</w:t>
+        <w:t>告別手工畫表格與計算欄位冒號！以實例包中的《智慧零售企劃草案_v2_new_final_FINAL.docx》為基底，指令 AI 自主解析非結構化草案，重構為標準 Markdown 商業公文、主管核示引用框、金額強制靠右表格與待辦核選清單。</w:t>
         <w:br/>
       </w:r>
       <w:r>
@@ -522,13 +522,73 @@
         <w:br/>
       </w:r>
       <w:r>
-        <w:t>• 步驟 1：複製下方【任務二 Prompt】。</w:t>
+        <w:t>• 步驟 1：檢視下方【災難包原始未整理草案文本】（已內嵌於提示詞中）。</w:t>
         <w:br/>
-        <w:t>• 步驟 2：貼入 AI 對話框送出，觀察 AI 在 3 秒內自主計算冒號位置（|:---:| 置中、|---:| 靠右對齊）。</w:t>
+        <w:t>• 步驟 2：複製下方【任務二 Prompt】貼入 AI 對話視窗送出。</w:t>
         <w:br/>
-        <w:t>• 步驟 3：檢查產出的四欄表格（分區、門市數、報廢率改善、預估月效益），金額欄位是否已靠右對齊！</w:t>
+        <w:t>• 步驟 3：觀察 AI 在 3 秒內自主解析草案數字，自動計算冒號位置（|:---:| 置中、|---:| 靠右對齊）。</w:t>
+        <w:br/>
+        <w:t>• 步驟 4：檢查產出的四欄表格（分區、門市數、報廢率、預估月效益），金額欄位是否已精準靠右對齊！</w:t>
       </w:r>
     </w:p>
+    <w:tbl>
+      <w:tblPr>
+        <w:tblW w:type="auto" w:w="0"/>
+        <w:tblLook w:firstColumn="1" w:firstRow="1" w:lastColumn="0" w:lastRow="0" w:noHBand="0" w:noVBand="1" w:val="04A0"/>
+      </w:tblPr>
+      <w:tblGrid>
+        <w:gridCol w:w="9360"/>
+      </w:tblGrid>
+      <w:tr>
+        <w:tc>
+          <w:tcPr>
+            <w:tcW w:type="dxa" w:w="9360"/>
+            <w:shd w:fill="FEE2E2"/>
+            <w:tcMar>
+              <w:top w:w="140" w:type="dxa"/>
+              <w:bottom w:w="140" w:type="dxa"/>
+              <w:left w:w="180" w:type="dxa"/>
+              <w:right w:w="180" w:type="dxa"/>
+            </w:tcMar>
+          </w:tcPr>
+          <w:p>
+            <w:pPr>
+              <w:spacing w:before="80" w:after="80" w:line="276" w:lineRule="auto"/>
+            </w:pPr>
+            <w:r>
+              <w:rPr>
+                <w:b/>
+                <w:color w:val="991B1B"/>
+                <w:sz w:val="19"/>
+              </w:rPr>
+              <w:t>📁【災難包檔案 5 原始內容】：智慧零售企劃草案_v2_new_final_FINAL.docx</w:t>
+              <w:br/>
+            </w:r>
+            <w:r>
+              <w:rPr>
+                <w:color w:val="374151"/>
+                <w:sz w:val="17"/>
+              </w:rPr>
+              <w:t>智慧零售與全台門市 POS 系統升級專案草案 (未整理版)</w:t>
+              <w:br/>
+              <w:t>發文單位：總經理室專案小組</w:t>
+              <w:br/>
+              <w:t>現況說明：目前全台共 18 家門市，北區 6 店試辦電子標籤後鮮食報廢率降至 5.1%，月省 42 萬元；中區 6 店報廢率 7.8%，預估改善可省 38 萬元；南區 6 店報廢率 8.1%，預估改善可省 40 萬元。全案硬體升級預算 18 家門市共需 153 萬元。</w:t>
+              <w:br/>
+              <w:t>預定對策：</w:t>
+              <w:br/>
+              <w:t>1. 資訊部於 9/25 前完成 POS 硬體採購合約修訂。</w:t>
+              <w:br/>
+              <w:t>2. 營運部於 10/15 前完成中南區門市教育訓練時程規劃。</w:t>
+              <w:br/>
+              <w:t>3. 全台 18 家門市預計於 11/1 正式切換上線。</w:t>
+              <w:br/>
+              <w:t>請依照標準公文格式與 Markdown 四欄表格整理，並包含核選清單。</w:t>
+            </w:r>
+          </w:p>
+        </w:tc>
+      </w:tr>
+    </w:tbl>
     <w:tbl>
       <w:tblPr>
         <w:tblW w:type="auto" w:w="0"/>
@@ -576,21 +636,41 @@
                 <w:color w:val="0F172A"/>
                 <w:sz w:val="20"/>
               </w:rPr>
-              <w:t>【角色設定】：你是一位擁有 10 年跨國零售與商務管理經驗的總經理特助。</w:t>
+              <w:t>【角色設定】：你是一位擁有 10 年跨國零售與商務管理經驗的總經理特助 兼 商業營運分析師。</w:t>
               <w:br/>
-              <w:t>【背景情境】：公司正在推動「全台門市智慧數位轉型與 POS 系統升級專案」，需向董事會呈報標準公文與營運效益分析。</w:t>
+              <w:t>【任務背景】：請依據實例包中的《智慧零售企劃草案_v2_new_final_FINAL.docx》（或下方未整理草案內容），將非結構化草案重構為符合 ISO 規範的標準 Markdown 商業公文。</w:t>
+              <w:br/>
+              <w:t>【原始草案內容】：</w:t>
+              <w:br/>
+              <w:t>--------------------------------------------------</w:t>
+              <w:br/>
+              <w:t>智慧零售與全台門市 POS 系統升級專案草案 (未整理版)</w:t>
+              <w:br/>
+              <w:t>發文單位：總經理室專案小組</w:t>
+              <w:br/>
+              <w:t>現況說明：目前全台共 18 家門市，北區 6 店試辦電子標籤後鮮食報廢率降至 5.1%，月省 42 萬元；中區 6 店報廢率 7.8%，預估改善可省 38 萬元；南區 6 店報廢率 8.1%，預估改善可省 40 萬元。全案硬體升級預算 18 家門市共需 153 萬元。</w:t>
+              <w:br/>
+              <w:t>預定對策：</w:t>
+              <w:br/>
+              <w:t>1. 資訊部於 9/25 前完成 POS 硬體採購合約修訂。</w:t>
+              <w:br/>
+              <w:t>2. 營運部於 10/15 前完成中南區門市教育訓練時程規劃。</w:t>
+              <w:br/>
+              <w:t>3. 全台 18 家門市預計於 11/1 正式切換上線。</w:t>
+              <w:br/>
+              <w:t>--------------------------------------------------</w:t>
               <w:br/>
               <w:t>【約束限制】：</w:t>
               <w:br/>
               <w:t>1. 產出標準 Markdown 商業公文：包含一級標題、二級案由、高階主管核示引用框 (&gt;)。</w:t>
               <w:br/>
-              <w:t>2. 繪製一張四欄營運數據分析表（分區、門市數、鮮食報廢率改善、預估月效益/預算），數值與金額欄位強制靠右對齊 (|---:|)。</w:t>
+              <w:t>2. 繪製一張四欄營運數據分析表（分區、門市數、鮮食報廢率、預估月效益/預算），數據與金額欄位強制靠右對齊 (|---:|)，不可缺漏草案數據。</w:t>
               <w:br/>
-              <w:t>3. 條列 3 項具體行動對策，使用帶有負責人與截止日期的 Markdown 核選清單 (- [ ])。</w:t>
+              <w:t>3. 條列 3 項具體行動對策，轉化為帶有負責人與截止日期的 Markdown 核選清單 (- [ ])。</w:t>
               <w:br/>
-              <w:t>4. 格式嚴謹工整，杜絕口語冗詞。</w:t>
+              <w:t>4. 格式嚴謹工整，數據必須精確對應草案，杜絕口語冗詞與數據幻覺。</w:t>
               <w:br/>
-              <w:t>【核心任務】：請產出符合上述規格的完整 Markdown 公文草案！</w:t>
+              <w:t>【核心任務】：請產出符合上述規格的完整 Markdown 公文底稿！</w:t>
             </w:r>
           </w:p>
           <w:p>
@@ -603,7 +683,7 @@
                 <w:color w:val="B45309"/>
                 <w:sz w:val="19"/>
               </w:rPr>
-              <w:t>💡 經理人操作要領：完全不用手工對齊，AI 自動精確設定 |---:| 靠右語法。</w:t>
+              <w:t>💡 經理人操作要領：以真實災難草案為基底，AI 自動精確解析數據並設定 |---:| 靠右對齊。</w:t>
             </w:r>
           </w:p>
         </w:tc>

</xml_diff>